<commit_message>
Rename Honest notes section to Consideration notes
</commit_message>
<xml_diff>
--- a/manual/crop_water_needs.docx
+++ b/manual/crop_water_needs.docx
@@ -704,12 +704,12 @@
         </w:numPr>
         <w:pStyle w:val="Compact"/>
       </w:pPr>
-      <w:hyperlink w:anchor="Xe6768d68bd97305a4aa665e622061fe3243b810">
+      <w:hyperlink w:anchor="X16eeec3bba325d0db3a68fd0193d3584b11ad1a">
         <w:r>
           <w:rPr>
             <w:rStyle w:val="Hyperlink"/>
           </w:rPr>
-          <w:t xml:space="preserve">Honest notes on the numbers</w:t>
+          <w:t xml:space="preserve">Consideration notes on the numbers</w:t>
         </w:r>
       </w:hyperlink>
     </w:p>
@@ -11589,13 +11589,13 @@
       </w:r>
     </w:p>
     <w:bookmarkEnd w:id="53"/>
-    <w:bookmarkStart w:id="54" w:name="honest-notes-on-the-numbers"/>
+    <w:bookmarkStart w:id="54" w:name="consideration-notes-on-the-numbers"/>
     <w:p>
       <w:pPr>
         <w:pStyle w:val="Heading2"/>
       </w:pPr>
       <w:r>
-        <w:t xml:space="preserve">14. Honest notes on the numbers</w:t>
+        <w:t xml:space="preserve">14. Consideration notes on the numbers</w:t>
       </w:r>
     </w:p>
     <w:p>
@@ -11731,7 +11731,7 @@
         <w:t xml:space="preserve"> </w:t>
       </w:r>
       <w:r>
-        <w:t xml:space="preserve">than the simple number — the daily balance in Section 11 is the honest refiner.</w:t>
+        <w:t xml:space="preserve">than the simple number — the daily balance in Section 11 refines it.</w:t>
       </w:r>
     </w:p>
     <w:p>

</xml_diff>

<commit_message>
Crop-water manual: cite figures inline as (Figure N); drop duplicated captions
</commit_message>
<xml_diff>
--- a/manual/crop_water_needs.docx
+++ b/manual/crop_water_needs.docx
@@ -924,92 +924,82 @@
         <w:pStyle w:val="BodyText"/>
       </w:pPr>
       <w:r>
+        <w:t xml:space="preserve">Seen at a glance, that is the whole problem: the blue bars are the rain Kumasi can expect</w:t>
+      </w:r>
+      <w:r>
+        <w:t xml:space="preserve"> </w:t>
+      </w:r>
+      <w:r>
+        <w:t xml:space="preserve">in an average month; the orange line is how much water the atmosphere tries to evaporate each</w:t>
+      </w:r>
+      <w:r>
+        <w:t xml:space="preserve"> </w:t>
+      </w:r>
+      <w:r>
+        <w:t xml:space="preserve">day (the</w:t>
+      </w:r>
+      <w:r>
+        <w:t xml:space="preserve"> </w:t>
+      </w:r>
+      <w:r>
+        <w:t xml:space="preserve">“</w:t>
+      </w:r>
+      <w:r>
+        <w:t xml:space="preserve">demand</w:t>
+      </w:r>
+      <w:r>
+        <w:t xml:space="preserve">”</w:t>
+      </w:r>
+      <w:r>
+        <w:t xml:space="preserve">). Where the orange line is high and the blue bars are low —</w:t>
+      </w:r>
+      <w:r>
+        <w:t xml:space="preserve"> </w:t>
+      </w:r>
+      <w:r>
         <w:rPr>
           <w:bCs/>
           <w:b/>
         </w:rPr>
-        <w:t xml:space="preserve">Figure 1</w:t>
-      </w:r>
-      <w:r>
-        <w:t xml:space="preserve"> </w:t>
-      </w:r>
-      <w:r>
-        <w:t xml:space="preserve">shows the whole problem at a glance: the blue bars are the rain Kumasi can expect</w:t>
-      </w:r>
-      <w:r>
-        <w:t xml:space="preserve"> </w:t>
-      </w:r>
-      <w:r>
-        <w:t xml:space="preserve">in an average month; the orange line is how much water the atmosphere tries to evaporate each</w:t>
-      </w:r>
-      <w:r>
-        <w:t xml:space="preserve"> </w:t>
-      </w:r>
-      <w:r>
-        <w:t xml:space="preserve">day (the</w:t>
-      </w:r>
-      <w:r>
-        <w:t xml:space="preserve"> </w:t>
-      </w:r>
-      <w:r>
-        <w:t xml:space="preserve">“</w:t>
-      </w:r>
-      <w:r>
-        <w:t xml:space="preserve">demand</w:t>
-      </w:r>
-      <w:r>
-        <w:t xml:space="preserve">”</w:t>
-      </w:r>
-      <w:r>
-        <w:t xml:space="preserve">). Where the orange line is high and the blue bars are low —</w:t>
-      </w:r>
-      <w:r>
-        <w:t xml:space="preserve"> </w:t>
+        <w:t xml:space="preserve">December,</w:t>
       </w:r>
       <w:r>
         <w:rPr>
           <w:bCs/>
           <w:b/>
         </w:rPr>
-        <w:t xml:space="preserve">December,</w:t>
+        <w:t xml:space="preserve"> </w:t>
       </w:r>
       <w:r>
         <w:rPr>
           <w:bCs/>
           <w:b/>
         </w:rPr>
-        <w:t xml:space="preserve"> </w:t>
-      </w:r>
-      <w:r>
-        <w:rPr>
-          <w:bCs/>
-          <w:b/>
-        </w:rPr>
         <w:t xml:space="preserve">January, February</w:t>
       </w:r>
       <w:r>
         <w:t xml:space="preserve"> </w:t>
       </w:r>
       <w:r>
-        <w:t xml:space="preserve">— a crop is thirsty and the sky will not help. That gap is what irrigation</w:t>
-      </w:r>
-      <w:r>
-        <w:t xml:space="preserve"> </w:t>
-      </w:r>
-      <w:r>
-        <w:t xml:space="preserve">has to fill.</w:t>
-      </w:r>
-    </w:p>
-    <w:p>
-      <w:pPr>
-        <w:pStyle w:val="CaptionedFigure"/>
+        <w:t xml:space="preserve">— a crop is thirsty and the sky will not help, and that gap is what</w:t>
+      </w:r>
+      <w:r>
+        <w:t xml:space="preserve"> </w:t>
+      </w:r>
+      <w:r>
+        <w:t xml:space="preserve">irrigation has to fill (Figure 1).</w:t>
+      </w:r>
+    </w:p>
+    <w:p>
+      <w:pPr>
+        <w:pStyle w:val="BodyText"/>
       </w:pPr>
       <w:r>
         <w:drawing>
           <wp:inline>
             <wp:extent cx="5334000" cy="3167062"/>
             <wp:effectExtent b="0" l="0" r="0" t="0"/>
-            <wp:docPr descr="Figure 1. Kumasi climate normals 2015–2024: monthly rainfall (bars) against atmospheric water demand ETo (line)." title="" id="22" name="Picture"/>
+            <wp:docPr descr="" title="" id="22" name="Picture"/>
             <a:graphic>
               <a:graphicData uri="http://schemas.openxmlformats.org/drawingml/2006/picture">
                 <pic:pic>
@@ -1045,26 +1035,6 @@
             </a:graphic>
           </wp:inline>
         </w:drawing>
-      </w:r>
-    </w:p>
-    <w:p>
-      <w:pPr>
-        <w:pStyle w:val="ImageCaption"/>
-      </w:pPr>
-      <w:r>
-        <w:t xml:space="preserve">Figure 1. Kumasi climate normals 2015–2024: monthly rainfall (bars) against atmospheric water demand ETo (line).</w:t>
-      </w:r>
-    </w:p>
-    <w:p>
-      <w:pPr>
-        <w:pStyle w:val="BodyText"/>
-      </w:pPr>
-      <w:r>
-        <w:rPr>
-          <w:iCs/>
-          <w:i/>
-        </w:rPr>
-        <w:t xml:space="preserve">Figure 1. Kumasi monthly rainfall (blue bars) and reference evapotranspiration, the atmosphere’s water demand (orange line), averaged over 2015–2024. The dry, thirsty Harmattan window — December to February — is where irrigation matters most.</w:t>
       </w:r>
     </w:p>
     <w:p>
@@ -4986,41 +4956,37 @@
         <w:pStyle w:val="FirstParagraph"/>
       </w:pPr>
       <w:r>
-        <w:rPr>
-          <w:bCs/>
-          <w:b/>
-        </w:rPr>
-        <w:t xml:space="preserve">Figure 2</w:t>
-      </w:r>
-      <w:r>
-        <w:t xml:space="preserve"> </w:t>
-      </w:r>
-      <w:r>
-        <w:t xml:space="preserve">shows why the gap opens up. The orange bars are the crop’s daily water use climbing</w:t>
-      </w:r>
-      <w:r>
-        <w:t xml:space="preserve"> </w:t>
-      </w:r>
-      <w:r>
-        <w:t xml:space="preserve">as the plants grow; the blue bars are rainfall — frequent early, then drying up. After the first</w:t>
-      </w:r>
-      <w:r>
-        <w:t xml:space="preserve"> </w:t>
-      </w:r>
-      <w:r>
-        <w:t xml:space="preserve">few weeks the crop is drinking steadily while the sky has gone quiet.</w:t>
-      </w:r>
-    </w:p>
-    <w:p>
-      <w:pPr>
-        <w:pStyle w:val="CaptionedFigure"/>
+        <w:t xml:space="preserve">You can see why the gap opens up: the orange bars are the crop’s daily water use climbing as the</w:t>
+      </w:r>
+      <w:r>
+        <w:t xml:space="preserve"> </w:t>
+      </w:r>
+      <w:r>
+        <w:t xml:space="preserve">plants grow, and the blue bars are rainfall — frequent early, then drying up. After the first few</w:t>
+      </w:r>
+      <w:r>
+        <w:t xml:space="preserve"> </w:t>
+      </w:r>
+      <w:r>
+        <w:t xml:space="preserve">weeks the crop is drinking steadily while the sky has gone quiet, and the space between the two is</w:t>
+      </w:r>
+      <w:r>
+        <w:t xml:space="preserve"> </w:t>
+      </w:r>
+      <w:r>
+        <w:t xml:space="preserve">what irrigation must supply (Figure 2).</w:t>
+      </w:r>
+    </w:p>
+    <w:p>
+      <w:pPr>
+        <w:pStyle w:val="BodyText"/>
       </w:pPr>
       <w:r>
         <w:drawing>
           <wp:inline>
             <wp:extent cx="5334000" cy="3167062"/>
             <wp:effectExtent b="0" l="0" r="0" t="0"/>
-            <wp:docPr descr="Figure 2. Dry-season tomato near Kumasi: daily crop water use (orange) against daily rainfall (blue)." title="" id="31" name="Picture"/>
+            <wp:docPr descr="" title="" id="31" name="Picture"/>
             <a:graphic>
               <a:graphicData uri="http://schemas.openxmlformats.org/drawingml/2006/picture">
                 <pic:pic>
@@ -5060,54 +5026,6 @@
     </w:p>
     <w:p>
       <w:pPr>
-        <w:pStyle w:val="ImageCaption"/>
-      </w:pPr>
-      <w:r>
-        <w:t xml:space="preserve">Figure 2. Dry-season tomato near Kumasi: daily crop water use (orange) against daily rainfall (blue).</w:t>
-      </w:r>
-    </w:p>
-    <w:p>
-      <w:pPr>
-        <w:pStyle w:val="BodyText"/>
-      </w:pPr>
-      <w:r>
-        <w:rPr>
-          <w:iCs/>
-          <w:i/>
-        </w:rPr>
-        <w:t xml:space="preserve">Figure 2. Daily crop water use (ETc, orange) and rainfall (blue) for a tomato crop planted</w:t>
-      </w:r>
-      <w:r>
-        <w:rPr>
-          <w:iCs/>
-          <w:i/>
-        </w:rPr>
-        <w:t xml:space="preserve"> </w:t>
-      </w:r>
-      <w:r>
-        <w:rPr>
-          <w:iCs/>
-          <w:i/>
-        </w:rPr>
-        <w:t xml:space="preserve">15 November near Kumasi. The crop’s thirst rises through the season while dry-season rainfall</w:t>
-      </w:r>
-      <w:r>
-        <w:rPr>
-          <w:iCs/>
-          <w:i/>
-        </w:rPr>
-        <w:t xml:space="preserve"> </w:t>
-      </w:r>
-      <w:r>
-        <w:rPr>
-          <w:iCs/>
-          <w:i/>
-        </w:rPr>
-        <w:t xml:space="preserve">fades — the space between them is what irrigation must supply.</w:t>
-      </w:r>
-    </w:p>
-    <w:p>
-      <w:pPr>
         <w:pStyle w:val="BodyText"/>
       </w:pPr>
       <w:r>
@@ -6935,35 +6853,31 @@
         <w:pStyle w:val="BodyText"/>
       </w:pPr>
       <w:r>
-        <w:rPr>
-          <w:bCs/>
-          <w:b/>
-        </w:rPr>
-        <w:t xml:space="preserve">Figure 3</w:t>
-      </w:r>
-      <w:r>
-        <w:t xml:space="preserve"> </w:t>
-      </w:r>
-      <w:r>
-        <w:t xml:space="preserve">draws the last column: irrigation need, dry-season planting versus main-season</w:t>
-      </w:r>
-      <w:r>
-        <w:t xml:space="preserve"> </w:t>
-      </w:r>
-      <w:r>
-        <w:t xml:space="preserve">planting.</w:t>
-      </w:r>
-    </w:p>
-    <w:p>
-      <w:pPr>
-        <w:pStyle w:val="CaptionedFigure"/>
+        <w:t xml:space="preserve">The last column — irrigation need, dry-season planting (orange) versus main-season planting</w:t>
+      </w:r>
+      <w:r>
+        <w:t xml:space="preserve"> </w:t>
+      </w:r>
+      <w:r>
+        <w:t xml:space="preserve">(green) — makes the contrast plain: in the main season seasonal rainfall meets or exceeds the</w:t>
+      </w:r>
+      <w:r>
+        <w:t xml:space="preserve"> </w:t>
+      </w:r>
+      <w:r>
+        <w:t xml:space="preserve">crop’s need, so the top-up is essentially zero (Figure 3).</w:t>
+      </w:r>
+    </w:p>
+    <w:p>
+      <w:pPr>
+        <w:pStyle w:val="BodyText"/>
       </w:pPr>
       <w:r>
         <w:drawing>
           <wp:inline>
             <wp:extent cx="5334000" cy="3167062"/>
             <wp:effectExtent b="0" l="0" r="0" t="0"/>
-            <wp:docPr descr="Figure 3. Irrigation top-up needed by crop, dry-season vs main-season planting." title="" id="35" name="Picture"/>
+            <wp:docPr descr="" title="" id="35" name="Picture"/>
             <a:graphic>
               <a:graphicData uri="http://schemas.openxmlformats.org/drawingml/2006/picture">
                 <pic:pic>
@@ -7002,54 +6916,6 @@
       </w:r>
     </w:p>
     <w:p>
-      <w:pPr>
-        <w:pStyle w:val="ImageCaption"/>
-      </w:pPr>
-      <w:r>
-        <w:t xml:space="preserve">Figure 3. Irrigation top-up needed by crop, dry-season vs main-season planting.</w:t>
-      </w:r>
-    </w:p>
-    <w:p>
-      <w:pPr>
-        <w:pStyle w:val="BodyText"/>
-      </w:pPr>
-      <w:r>
-        <w:rPr>
-          <w:iCs/>
-          <w:i/>
-        </w:rPr>
-        <w:t xml:space="preserve">Figure 3. Seasonal irrigation top-up for each crop when planted in the dry season (orange) versus</w:t>
-      </w:r>
-      <w:r>
-        <w:rPr>
-          <w:iCs/>
-          <w:i/>
-        </w:rPr>
-        <w:t xml:space="preserve"> </w:t>
-      </w:r>
-      <w:r>
-        <w:rPr>
-          <w:iCs/>
-          <w:i/>
-        </w:rPr>
-        <w:t xml:space="preserve">the main rains (green). In the main season, seasonal rainfall meets or exceeds the crop’s need,</w:t>
-      </w:r>
-      <w:r>
-        <w:rPr>
-          <w:iCs/>
-          <w:i/>
-        </w:rPr>
-        <w:t xml:space="preserve"> </w:t>
-      </w:r>
-      <w:r>
-        <w:rPr>
-          <w:iCs/>
-          <w:i/>
-        </w:rPr>
-        <w:t xml:space="preserve">so the top-up is essentially zero.</w:t>
-      </w:r>
-    </w:p>
-    <w:p>
       <w:r>
         <w:pict>
           <v:rect style="width:0;height:1.5pt" o:hralign="center" o:hrstd="t" o:hr="t"/>
@@ -7864,14 +7730,34 @@
     </w:tbl>
     <w:p>
       <w:pPr>
-        <w:pStyle w:val="CaptionedFigure"/>
+        <w:pStyle w:val="BodyText"/>
+      </w:pPr>
+      <w:r>
+        <w:t xml:space="preserve">Grown on rainfall alone, every one of these dry-season crops loses at least a quarter of its</w:t>
+      </w:r>
+      <w:r>
+        <w:t xml:space="preserve"> </w:t>
+      </w:r>
+      <w:r>
+        <w:t xml:space="preserve">harvest, and maize and onion lose well over half — the FAO-33 water–yield relation applied to the</w:t>
+      </w:r>
+      <w:r>
+        <w:t xml:space="preserve"> </w:t>
+      </w:r>
+      <w:r>
+        <w:t xml:space="preserve">shortfall each crop suffers (Figure 4).</w:t>
+      </w:r>
+    </w:p>
+    <w:p>
+      <w:pPr>
+        <w:pStyle w:val="BodyText"/>
       </w:pPr>
       <w:r>
         <w:drawing>
           <wp:inline>
             <wp:extent cx="5334000" cy="3167062"/>
             <wp:effectExtent b="0" l="0" r="0" t="0"/>
-            <wp:docPr descr="Figure 4. Share of yield forfeited if each dry-season crop is grown on rainfall alone." title="" id="39" name="Picture"/>
+            <wp:docPr descr="" title="" id="39" name="Picture"/>
             <a:graphic>
               <a:graphicData uri="http://schemas.openxmlformats.org/drawingml/2006/picture">
                 <pic:pic>
@@ -7907,54 +7793,6 @@
             </a:graphic>
           </wp:inline>
         </w:drawing>
-      </w:r>
-    </w:p>
-    <w:p>
-      <w:pPr>
-        <w:pStyle w:val="ImageCaption"/>
-      </w:pPr>
-      <w:r>
-        <w:t xml:space="preserve">Figure 4. Share of yield forfeited if each dry-season crop is grown on rainfall alone.</w:t>
-      </w:r>
-    </w:p>
-    <w:p>
-      <w:pPr>
-        <w:pStyle w:val="BodyText"/>
-      </w:pPr>
-      <w:r>
-        <w:rPr>
-          <w:iCs/>
-          <w:i/>
-        </w:rPr>
-        <w:t xml:space="preserve">Figure 4. The share of potential yield lost when a dry-season crop near Kumasi is grown on</w:t>
-      </w:r>
-      <w:r>
-        <w:rPr>
-          <w:iCs/>
-          <w:i/>
-        </w:rPr>
-        <w:t xml:space="preserve"> </w:t>
-      </w:r>
-      <w:r>
-        <w:rPr>
-          <w:iCs/>
-          <w:i/>
-        </w:rPr>
-        <w:t xml:space="preserve">rainfall alone, with no irrigation (FAO-33 water–yield relation). Every crop loses at least a</w:t>
-      </w:r>
-      <w:r>
-        <w:rPr>
-          <w:iCs/>
-          <w:i/>
-        </w:rPr>
-        <w:t xml:space="preserve"> </w:t>
-      </w:r>
-      <w:r>
-        <w:rPr>
-          <w:iCs/>
-          <w:i/>
-        </w:rPr>
-        <w:t xml:space="preserve">quarter of its harvest; maize and onion lose well over half.</w:t>
       </w:r>
     </w:p>
     <w:p>

</xml_diff>